<commit_message>
labels changed w day version. used weird method instead of 10fold cv
</commit_message>
<xml_diff>
--- a/cnn_finance_rapor.docx
+++ b/cnn_finance_rapor.docx
@@ -4,10 +4,18 @@
   <w:body>
     <w:p>
       <w:pPr>
-        <w:rPr>
-          <w:lang w:val="tr-TR"/>
-        </w:rPr>
-      </w:pPr>
+        <w:pStyle w:val="Heading1"/>
+        <w:jc w:val="center"/>
+        <w:rPr>
+          <w:lang w:val="tr-TR"/>
+        </w:rPr>
+      </w:pPr>
+      <w:r>
+        <w:rPr>
+          <w:lang w:val="tr-TR"/>
+        </w:rPr>
+        <w:t>Evrişimsel Sinir Ağı Kullanarak Trend Tahmini</w:t>
+      </w:r>
     </w:p>
     <w:p>
       <w:pPr>
@@ -106,12 +114,322 @@
           <w:lang w:val="tr-TR"/>
         </w:rPr>
         <w:t>i</w:t>
+      </w:r>
+    </w:p>
+    <w:p>
+      <w:pPr>
+        <w:ind w:left="360"/>
+        <w:jc w:val="both"/>
+        <w:rPr>
+          <w:lang w:val="tr-TR"/>
+        </w:rPr>
+      </w:pPr>
+      <w:r>
+        <w:rPr>
+          <w:lang w:val="tr-TR"/>
+        </w:rPr>
+        <w:t xml:space="preserve">Veri </w:t>
+      </w:r>
+      <w:r>
+        <w:rPr>
+          <w:lang w:val="tr-TR"/>
+        </w:rPr>
+        <w:t>olarak Amerikan</w:t>
+      </w:r>
+      <w:r>
+        <w:rPr>
+          <w:lang w:val="tr-TR"/>
+        </w:rPr>
+        <w:t xml:space="preserve"> borsasında işlem gören </w:t>
+      </w:r>
+      <w:r>
+        <w:rPr>
+          <w:lang w:val="tr-TR"/>
+        </w:rPr>
+        <w:t xml:space="preserve">19 adet yatırım fonunun 2000 ile 2017 arasındaki verileri kullanıldı. </w:t>
+      </w:r>
+      <w:r>
+        <w:rPr>
+          <w:lang w:val="tr-TR"/>
+        </w:rPr>
+        <w:t xml:space="preserve">Yatırım fonu kullanılmasının sebebi bu fonların çok fazla hisse senedinden oluşması ve dolayısıyla küçük etkilerden etkilenmiyor olmasıdır. </w:t>
+      </w:r>
+      <w:r>
+        <w:rPr>
+          <w:lang w:val="tr-TR"/>
+        </w:rPr>
+        <w:t>XLF, XLU, XLI, SPY, XLP, EWG, XLB, XLK, XLV, EWU, QQQ, EWH, EWC, XLY, EWW, DIA, XLE, EWA, EWJ kullanılan 19 yatırım fonunun kısaltmasıdır.</w:t>
+      </w:r>
+    </w:p>
+    <w:p>
+      <w:pPr>
+        <w:pStyle w:val="Heading2"/>
+        <w:rPr>
+          <w:lang w:val="tr-TR"/>
+        </w:rPr>
+      </w:pPr>
+      <w:r>
+        <w:rPr>
+          <w:lang w:val="tr-TR"/>
+        </w:rPr>
+        <w:t>İndikatörler</w:t>
+      </w:r>
+      <w:r>
+        <w:rPr>
+          <w:lang w:val="tr-TR"/>
+        </w:rPr>
+        <w:t xml:space="preserve"> ve </w:t>
+      </w:r>
+      <w:r>
+        <w:rPr>
+          <w:lang w:val="tr-TR"/>
+        </w:rPr>
+        <w:t>Öznitelikler</w:t>
+      </w:r>
+    </w:p>
+    <w:p>
+      <w:pPr>
+        <w:ind w:left="360"/>
+        <w:jc w:val="both"/>
+        <w:rPr>
+          <w:lang w:val="tr-TR"/>
+        </w:rPr>
+      </w:pPr>
+      <w:r>
+        <w:rPr>
+          <w:lang w:val="tr-TR"/>
+        </w:rPr>
+        <w:t xml:space="preserve">Sistemi besleyebilmek için fonun kendi verisi dışında yardımcı elemanlar kullanıldı. Bunlar önemli </w:t>
+      </w:r>
+      <w:proofErr w:type="gramStart"/>
+      <w:r>
+        <w:rPr>
+          <w:lang w:val="tr-TR"/>
+        </w:rPr>
+        <w:t>indikatörlerden</w:t>
+      </w:r>
+      <w:proofErr w:type="gramEnd"/>
+      <w:r>
+        <w:rPr>
+          <w:lang w:val="tr-TR"/>
+        </w:rPr>
+        <w:t xml:space="preserve"> seçildi. </w:t>
+      </w:r>
+      <w:r>
+        <w:rPr>
+          <w:lang w:val="tr-TR"/>
+        </w:rPr>
+        <w:t xml:space="preserve">RSI, SMA, MACD, Williams R, </w:t>
+      </w:r>
+      <w:proofErr w:type="spellStart"/>
+      <w:r>
+        <w:rPr>
+          <w:lang w:val="tr-TR"/>
+        </w:rPr>
+        <w:t>Stochastic</w:t>
+      </w:r>
+      <w:proofErr w:type="spellEnd"/>
+      <w:r>
+        <w:rPr>
+          <w:lang w:val="tr-TR"/>
+        </w:rPr>
+        <w:t xml:space="preserve"> </w:t>
+      </w:r>
+      <w:proofErr w:type="spellStart"/>
+      <w:r>
+        <w:rPr>
+          <w:lang w:val="tr-TR"/>
+        </w:rPr>
+        <w:t>Osilatör</w:t>
+      </w:r>
+      <w:proofErr w:type="spellEnd"/>
+      <w:r>
+        <w:rPr>
+          <w:lang w:val="tr-TR"/>
+        </w:rPr>
+        <w:t xml:space="preserve">, Ultimate </w:t>
+      </w:r>
+      <w:proofErr w:type="spellStart"/>
+      <w:r>
+        <w:rPr>
+          <w:lang w:val="tr-TR"/>
+        </w:rPr>
+        <w:t>Osilatör</w:t>
+      </w:r>
+      <w:proofErr w:type="spellEnd"/>
+      <w:r>
+        <w:rPr>
+          <w:lang w:val="tr-TR"/>
+        </w:rPr>
+        <w:t xml:space="preserve"> ve MFI </w:t>
+      </w:r>
+      <w:r>
+        <w:rPr>
+          <w:lang w:val="tr-TR"/>
+        </w:rPr>
+        <w:t xml:space="preserve">gibi </w:t>
+      </w:r>
+      <w:proofErr w:type="gramStart"/>
+      <w:r>
+        <w:rPr>
+          <w:lang w:val="tr-TR"/>
+        </w:rPr>
+        <w:t>indikatörler</w:t>
+      </w:r>
+      <w:proofErr w:type="gramEnd"/>
+      <w:r>
+        <w:rPr>
+          <w:lang w:val="tr-TR"/>
+        </w:rPr>
+        <w:t xml:space="preserve"> sisteme </w:t>
+      </w:r>
+      <w:r>
+        <w:rPr>
+          <w:lang w:val="tr-TR"/>
+        </w:rPr>
+        <w:t>dâhil</w:t>
+      </w:r>
+      <w:r>
+        <w:rPr>
+          <w:lang w:val="tr-TR"/>
+        </w:rPr>
+        <w:t xml:space="preserve"> edildi</w:t>
+      </w:r>
+      <w:r>
+        <w:rPr>
+          <w:lang w:val="tr-TR"/>
+        </w:rPr>
+        <w:t xml:space="preserve">. </w:t>
+      </w:r>
+      <w:r>
+        <w:rPr>
+          <w:lang w:val="tr-TR"/>
+        </w:rPr>
+        <w:t xml:space="preserve">Verinin kendisi ve bu </w:t>
+      </w:r>
+      <w:proofErr w:type="gramStart"/>
+      <w:r>
+        <w:rPr>
+          <w:lang w:val="tr-TR"/>
+        </w:rPr>
+        <w:t>indikatörlerin</w:t>
+      </w:r>
+      <w:proofErr w:type="gramEnd"/>
+      <w:r>
+        <w:rPr>
+          <w:lang w:val="tr-TR"/>
+        </w:rPr>
+        <w:t xml:space="preserve"> belirli bir kısmı modelin öznitelikleri olarak seçildi. Öznitelik sayısını </w:t>
+      </w:r>
+      <w:proofErr w:type="gramStart"/>
+      <w:r>
+        <w:rPr>
+          <w:lang w:val="tr-TR"/>
+        </w:rPr>
+        <w:t>indikatörlerin</w:t>
+      </w:r>
+      <w:proofErr w:type="gramEnd"/>
+      <w:r>
+        <w:rPr>
+          <w:lang w:val="tr-TR"/>
+        </w:rPr>
+        <w:t xml:space="preserve"> periyotları ayarlanarak arttırılıp </w:t>
+      </w:r>
+      <w:r>
+        <w:rPr>
+          <w:lang w:val="tr-TR"/>
+        </w:rPr>
+        <w:t>azaltıla biliniyor</w:t>
+      </w:r>
+      <w:r>
+        <w:rPr>
+          <w:lang w:val="tr-TR"/>
+        </w:rPr>
+        <w:t>. Bu şekilde 28 adet öznitelik kurulacak model için seçildi.</w:t>
+      </w:r>
+    </w:p>
+    <w:p>
+      <w:pPr>
+        <w:pStyle w:val="Heading2"/>
+        <w:rPr>
+          <w:lang w:val="tr-TR"/>
+        </w:rPr>
+      </w:pPr>
+      <w:r>
+        <w:rPr>
+          <w:lang w:val="tr-TR"/>
+        </w:rPr>
+        <w:t>Kümeleme</w:t>
+      </w:r>
+    </w:p>
+    <w:p>
+      <w:pPr>
+        <w:ind w:left="360"/>
+        <w:jc w:val="both"/>
+        <w:rPr>
+          <w:lang w:val="tr-TR"/>
+        </w:rPr>
+      </w:pPr>
+      <w:r>
+        <w:rPr>
+          <w:lang w:val="tr-TR"/>
+        </w:rPr>
+        <w:t>Evrişimsel sinir ağı resimler için geliştirilen bir yapay sinir ağıdır. Bu sinir ağı resimlerin pikselleri arasındaki bağları kullanır. Yani kısaca verilecek olan veride yatayda ve dikeyde bir bağlantı olmalıdır. Bu sebeple hiyerarşik kümeleme yöntemi kullanılarak seçilen öznitelikler kendi aralarında sıralandılar.</w:t>
+      </w:r>
+      <w:r>
+        <w:rPr>
+          <w:lang w:val="tr-TR"/>
+        </w:rPr>
+        <w:t xml:space="preserve"> Böylelikle dikey bağlantı sağlanmış oldu. Zaman serisi kullanıldığı için yatay uyum için herhangi bir işlem yapılması gerekmedi.</w:t>
+      </w:r>
+    </w:p>
+    <w:p>
+      <w:pPr>
+        <w:pStyle w:val="Heading2"/>
+        <w:rPr>
+          <w:lang w:val="tr-TR"/>
+        </w:rPr>
+      </w:pPr>
+      <w:r>
+        <w:rPr>
+          <w:lang w:val="tr-TR"/>
+        </w:rPr>
+        <w:t>Resim oluşturma</w:t>
+      </w:r>
+    </w:p>
+    <w:p>
+      <w:pPr>
+        <w:ind w:left="360"/>
+        <w:jc w:val="both"/>
+        <w:rPr>
+          <w:lang w:val="tr-TR"/>
+        </w:rPr>
+      </w:pPr>
+      <w:r>
+        <w:rPr>
+          <w:lang w:val="tr-TR"/>
+        </w:rPr>
+        <w:t>Model 28 özniteliği girdi olarak alacağı için ve evrişimsel sinir ağının eni-boyu aynı olan resimler istemesinden dolayı 28x28lik resimler oluşturmak gerekliydi. Bu resimleri elde edebilmek için kayan pencere yöntemi uygulanıp pencere her seferinde 1 gün sağa kaydırılarak 70.000 adet resim elde edildi.</w:t>
       </w:r>
       <w:bookmarkStart w:id="0" w:name="_GoBack"/>
       <w:bookmarkEnd w:id="0"/>
     </w:p>
     <w:p>
       <w:pPr>
+        <w:pStyle w:val="Heading2"/>
+        <w:rPr>
+          <w:lang w:val="tr-TR"/>
+        </w:rPr>
+      </w:pPr>
+      <w:r>
+        <w:rPr>
+          <w:lang w:val="tr-TR"/>
+        </w:rPr>
+        <w:t>Evrişimsel sinir ağı</w:t>
+      </w:r>
+    </w:p>
+    <w:p>
+      <w:pPr>
         <w:ind w:left="360"/>
         <w:jc w:val="both"/>
         <w:rPr>
@@ -122,67 +440,154 @@
         <w:rPr>
           <w:lang w:val="tr-TR"/>
         </w:rPr>
-        <w:t xml:space="preserve">Veri </w:t>
-      </w:r>
-      <w:r>
-        <w:rPr>
-          <w:lang w:val="tr-TR"/>
-        </w:rPr>
-        <w:t>olarak Amerikan</w:t>
-      </w:r>
-      <w:r>
-        <w:rPr>
-          <w:lang w:val="tr-TR"/>
-        </w:rPr>
-        <w:t xml:space="preserve"> borsasında işlem gören </w:t>
-      </w:r>
-      <w:r>
-        <w:rPr>
-          <w:lang w:val="tr-TR"/>
-        </w:rPr>
-        <w:t xml:space="preserve">19 adet yatırım fonunun 2000 ile 2017 arasındaki verileri kullanıldı. </w:t>
-      </w:r>
-      <w:r>
-        <w:rPr>
-          <w:lang w:val="tr-TR"/>
-        </w:rPr>
-        <w:t xml:space="preserve">Yatırım fonu kullanılmasının sebebi bu fonların çok fazla hisse senedinden oluşması ve dolayısıyla küçük etkilerden etkilenmiyor olmasıdır. </w:t>
-      </w:r>
-      <w:r>
-        <w:rPr>
-          <w:lang w:val="tr-TR"/>
-        </w:rPr>
-        <w:t>XLF, XLU, XLI, SPY, XLP, EWG, XLB, XLK, XLV, EWU, QQQ, EWH, EWC, XLY, EWW, DIA, XLE, EWA, EWJ kullanılan 19 yatırım fonunun kısaltmasıdır.</w:t>
+        <w:t>Model çeşitli katmanlardan oluşmaktadır.</w:t>
+      </w:r>
+      <w:r>
+        <w:rPr>
+          <w:lang w:val="tr-TR"/>
+        </w:rPr>
+        <w:t xml:space="preserve"> Ağ yapısı s</w:t>
+      </w:r>
+      <w:r>
+        <w:rPr>
+          <w:lang w:val="tr-TR"/>
+        </w:rPr>
+        <w:t>ırasıyla 2 adet aktivasyon fonksiyonu ‘</w:t>
+      </w:r>
+      <w:proofErr w:type="spellStart"/>
+      <w:r>
+        <w:rPr>
+          <w:lang w:val="tr-TR"/>
+        </w:rPr>
+        <w:t>relu</w:t>
+      </w:r>
+      <w:proofErr w:type="spellEnd"/>
+      <w:r>
+        <w:rPr>
+          <w:lang w:val="tr-TR"/>
+        </w:rPr>
+        <w:t>’ olan evrişimsel katman, 1 adet maksimum değeri alan katman</w:t>
+      </w:r>
+      <w:r>
+        <w:rPr>
+          <w:lang w:val="tr-TR"/>
+        </w:rPr>
+        <w:t>(</w:t>
+      </w:r>
+      <w:proofErr w:type="spellStart"/>
+      <w:r>
+        <w:rPr>
+          <w:lang w:val="tr-TR"/>
+        </w:rPr>
+        <w:t>maxpooling</w:t>
+      </w:r>
+      <w:proofErr w:type="spellEnd"/>
+      <w:r>
+        <w:rPr>
+          <w:lang w:val="tr-TR"/>
+        </w:rPr>
+        <w:t>)</w:t>
+      </w:r>
+      <w:r>
+        <w:rPr>
+          <w:lang w:val="tr-TR"/>
+        </w:rPr>
+        <w:t xml:space="preserve">, 1 adet </w:t>
+      </w:r>
+      <w:r>
+        <w:rPr>
+          <w:lang w:val="tr-TR"/>
+        </w:rPr>
+        <w:t xml:space="preserve">sinir ağının 4te birinin </w:t>
+      </w:r>
+      <w:proofErr w:type="spellStart"/>
+      <w:r>
+        <w:rPr>
+          <w:lang w:val="tr-TR"/>
+        </w:rPr>
+        <w:t>yoksayan</w:t>
+      </w:r>
+      <w:proofErr w:type="spellEnd"/>
+      <w:r>
+        <w:rPr>
+          <w:lang w:val="tr-TR"/>
+        </w:rPr>
+        <w:t xml:space="preserve"> katman(</w:t>
+      </w:r>
+      <w:proofErr w:type="spellStart"/>
+      <w:r>
+        <w:rPr>
+          <w:lang w:val="tr-TR"/>
+        </w:rPr>
+        <w:t>dropout</w:t>
+      </w:r>
+      <w:proofErr w:type="spellEnd"/>
+      <w:r>
+        <w:rPr>
+          <w:lang w:val="tr-TR"/>
+        </w:rPr>
+        <w:t>), 1 adet tümüyle bağlı katman(</w:t>
+      </w:r>
+      <w:proofErr w:type="spellStart"/>
+      <w:r>
+        <w:rPr>
+          <w:lang w:val="tr-TR"/>
+        </w:rPr>
+        <w:t>fully-connected</w:t>
+      </w:r>
+      <w:proofErr w:type="spellEnd"/>
+      <w:r>
+        <w:rPr>
+          <w:lang w:val="tr-TR"/>
+        </w:rPr>
+        <w:t>) ve 1 adet tümüyle bağlı ‘</w:t>
+      </w:r>
+      <w:proofErr w:type="spellStart"/>
+      <w:r>
+        <w:rPr>
+          <w:lang w:val="tr-TR"/>
+        </w:rPr>
+        <w:t>softmax</w:t>
+      </w:r>
+      <w:proofErr w:type="spellEnd"/>
+      <w:r>
+        <w:rPr>
+          <w:lang w:val="tr-TR"/>
+        </w:rPr>
+        <w:t>’ katmanından oluşmaktadır.</w:t>
+      </w:r>
+      <w:r>
+        <w:rPr>
+          <w:lang w:val="tr-TR"/>
+        </w:rPr>
+        <w:t xml:space="preserve"> </w:t>
       </w:r>
     </w:p>
     <w:p>
       <w:pPr>
-        <w:pStyle w:val="Heading2"/>
-        <w:rPr>
-          <w:lang w:val="tr-TR"/>
-        </w:rPr>
-      </w:pPr>
-      <w:r>
-        <w:rPr>
-          <w:lang w:val="tr-TR"/>
-        </w:rPr>
-        <w:t>İndikatörler</w:t>
-      </w:r>
-      <w:r>
-        <w:rPr>
-          <w:lang w:val="tr-TR"/>
-        </w:rPr>
-        <w:t xml:space="preserve"> ve </w:t>
-      </w:r>
-      <w:r>
-        <w:rPr>
-          <w:lang w:val="tr-TR"/>
-        </w:rPr>
-        <w:t>Öznitelikler</w:t>
-      </w:r>
+        <w:pStyle w:val="ListParagraph"/>
+        <w:jc w:val="both"/>
+        <w:rPr>
+          <w:lang w:val="tr-TR"/>
+        </w:rPr>
+      </w:pPr>
     </w:p>
     <w:p>
       <w:pPr>
+        <w:pStyle w:val="Heading2"/>
+        <w:rPr>
+          <w:lang w:val="tr-TR"/>
+        </w:rPr>
+      </w:pPr>
+      <w:r>
+        <w:rPr>
+          <w:lang w:val="tr-TR"/>
+        </w:rPr>
+        <w:t>Sonuçlar</w:t>
+      </w:r>
+    </w:p>
+    <w:p>
+      <w:pPr>
         <w:ind w:left="360"/>
         <w:jc w:val="both"/>
         <w:rPr>
@@ -193,493 +598,114 @@
         <w:rPr>
           <w:lang w:val="tr-TR"/>
         </w:rPr>
-        <w:t xml:space="preserve">Sistemi besleyebilmek için fonun kendi verisi dışında yardımcı elemanlar kullanıldı. Bunlar önemli </w:t>
-      </w:r>
-      <w:proofErr w:type="gramStart"/>
-      <w:r>
-        <w:rPr>
-          <w:lang w:val="tr-TR"/>
-        </w:rPr>
-        <w:t>indikatörlerden</w:t>
-      </w:r>
-      <w:proofErr w:type="gramEnd"/>
-      <w:r>
-        <w:rPr>
-          <w:lang w:val="tr-TR"/>
-        </w:rPr>
-        <w:t xml:space="preserve"> seçildi. </w:t>
-      </w:r>
-      <w:r>
-        <w:rPr>
-          <w:lang w:val="tr-TR"/>
-        </w:rPr>
-        <w:t xml:space="preserve">RSI, SMA, MACD, Williams R, </w:t>
+        <w:t xml:space="preserve">Değerlendirme için 10-fold çapraz değerlendirme yöntemi kullanılmıştır. </w:t>
       </w:r>
       <w:proofErr w:type="spellStart"/>
       <w:r>
         <w:rPr>
           <w:lang w:val="tr-TR"/>
         </w:rPr>
-        <w:t>Stochastic</w:t>
+        <w:t>Epoch</w:t>
       </w:r>
       <w:proofErr w:type="spellEnd"/>
       <w:r>
         <w:rPr>
           <w:lang w:val="tr-TR"/>
         </w:rPr>
-        <w:t xml:space="preserve"> </w:t>
+        <w:t xml:space="preserve"> sayısı 100 olarak belirlenmiş olup her seferinde resimlerin 1024 tanesiyle işlem yapılmaktadır. 70000 resim kontrol edildiğinden ve ağırlıklar onlara göre ayarlandığında bir </w:t>
       </w:r>
       <w:proofErr w:type="spellStart"/>
       <w:r>
         <w:rPr>
           <w:lang w:val="tr-TR"/>
         </w:rPr>
-        <w:t>Osilatör</w:t>
+        <w:t>epoch</w:t>
       </w:r>
       <w:proofErr w:type="spellEnd"/>
       <w:r>
         <w:rPr>
           <w:lang w:val="tr-TR"/>
         </w:rPr>
-        <w:t xml:space="preserve">, Ultimate </w:t>
+        <w:t xml:space="preserve"> ilerlenmiş olmaktadır. Çözücü olarak ‘</w:t>
       </w:r>
       <w:proofErr w:type="spellStart"/>
       <w:r>
         <w:rPr>
           <w:lang w:val="tr-TR"/>
         </w:rPr>
-        <w:t>Osilatör</w:t>
+        <w:t>adadelta</w:t>
       </w:r>
       <w:proofErr w:type="spellEnd"/>
       <w:r>
         <w:rPr>
           <w:lang w:val="tr-TR"/>
         </w:rPr>
-        <w:t xml:space="preserve"> ve MFI </w:t>
-      </w:r>
-      <w:r>
-        <w:rPr>
-          <w:lang w:val="tr-TR"/>
-        </w:rPr>
-        <w:t xml:space="preserve">gibi </w:t>
-      </w:r>
-      <w:proofErr w:type="gramStart"/>
-      <w:r>
-        <w:rPr>
-          <w:lang w:val="tr-TR"/>
-        </w:rPr>
-        <w:t>indikatörler</w:t>
-      </w:r>
-      <w:proofErr w:type="gramEnd"/>
-      <w:r>
-        <w:rPr>
-          <w:lang w:val="tr-TR"/>
-        </w:rPr>
-        <w:t xml:space="preserve"> sisteme </w:t>
-      </w:r>
-      <w:r>
-        <w:rPr>
-          <w:lang w:val="tr-TR"/>
-        </w:rPr>
-        <w:t>dâhil</w:t>
-      </w:r>
-      <w:r>
-        <w:rPr>
-          <w:lang w:val="tr-TR"/>
-        </w:rPr>
-        <w:t xml:space="preserve"> edildi</w:t>
-      </w:r>
-      <w:r>
-        <w:rPr>
-          <w:lang w:val="tr-TR"/>
-        </w:rPr>
-        <w:t xml:space="preserve">. </w:t>
-      </w:r>
-      <w:r>
-        <w:rPr>
-          <w:lang w:val="tr-TR"/>
-        </w:rPr>
-        <w:t xml:space="preserve">Verinin kendisi ve bu </w:t>
-      </w:r>
-      <w:proofErr w:type="gramStart"/>
-      <w:r>
-        <w:rPr>
-          <w:lang w:val="tr-TR"/>
-        </w:rPr>
-        <w:t>indikatörlerin</w:t>
-      </w:r>
-      <w:proofErr w:type="gramEnd"/>
-      <w:r>
-        <w:rPr>
-          <w:lang w:val="tr-TR"/>
-        </w:rPr>
-        <w:t xml:space="preserve"> belirli bir kısmı modelin öznitelikleri olarak seçildi. Öznitelik sayısını </w:t>
-      </w:r>
-      <w:proofErr w:type="gramStart"/>
-      <w:r>
-        <w:rPr>
-          <w:lang w:val="tr-TR"/>
-        </w:rPr>
-        <w:t>indikatörlerin</w:t>
-      </w:r>
-      <w:proofErr w:type="gramEnd"/>
-      <w:r>
-        <w:rPr>
-          <w:lang w:val="tr-TR"/>
-        </w:rPr>
-        <w:t xml:space="preserve"> periyotları ayarlanarak arttırılıp </w:t>
-      </w:r>
-      <w:r>
-        <w:rPr>
-          <w:lang w:val="tr-TR"/>
-        </w:rPr>
-        <w:t>azaltıla biliniyor</w:t>
-      </w:r>
-      <w:r>
-        <w:rPr>
-          <w:lang w:val="tr-TR"/>
-        </w:rPr>
-        <w:t>. Bu şekilde 28 adet öznitelik kurulacak model için seçildi.</w:t>
+        <w:t xml:space="preserve">’ algoritması kullanılmıştır. </w:t>
+      </w:r>
+      <w:r>
+        <w:rPr>
+          <w:lang w:val="tr-TR"/>
+        </w:rPr>
+        <w:t xml:space="preserve">Başarım </w:t>
+      </w:r>
+      <w:r>
+        <w:rPr>
+          <w:lang w:val="tr-TR"/>
+        </w:rPr>
+        <w:t xml:space="preserve">göz önüne alınarak ağırlıklar güncellenmiştir. Alıcı işletim </w:t>
+      </w:r>
+      <w:r>
+        <w:rPr>
+          <w:lang w:val="tr-TR"/>
+        </w:rPr>
+        <w:lastRenderedPageBreak/>
+        <w:t>karakteristiği (ROC) ve kesinlik-hassasiyet (</w:t>
+      </w:r>
+      <w:proofErr w:type="spellStart"/>
+      <w:r>
+        <w:rPr>
+          <w:lang w:val="tr-TR"/>
+        </w:rPr>
+        <w:t>precision-recall</w:t>
+      </w:r>
+      <w:proofErr w:type="spellEnd"/>
+      <w:r>
+        <w:rPr>
+          <w:lang w:val="tr-TR"/>
+        </w:rPr>
+        <w:t xml:space="preserve">) eğrileri figür 1 ve 2 de gösterilmiştir. 10-fold </w:t>
+      </w:r>
+      <w:r>
+        <w:rPr>
+          <w:lang w:val="tr-TR"/>
+        </w:rPr>
+        <w:t>başarım</w:t>
+      </w:r>
+      <w:r>
+        <w:rPr>
+          <w:lang w:val="tr-TR"/>
+        </w:rPr>
+        <w:t xml:space="preserve"> tablosu tablo 1 de gösterilmiştir.</w:t>
       </w:r>
     </w:p>
     <w:p>
       <w:pPr>
-        <w:pStyle w:val="Heading2"/>
-        <w:rPr>
-          <w:lang w:val="tr-TR"/>
-        </w:rPr>
-      </w:pPr>
-      <w:r>
-        <w:rPr>
-          <w:lang w:val="tr-TR"/>
-        </w:rPr>
-        <w:t>Kümeleme</w:t>
-      </w:r>
+        <w:ind w:left="360"/>
+        <w:rPr>
+          <w:lang w:val="tr-TR"/>
+        </w:rPr>
+      </w:pPr>
     </w:p>
     <w:p>
       <w:pPr>
         <w:ind w:left="360"/>
-        <w:jc w:val="both"/>
-        <w:rPr>
-          <w:lang w:val="tr-TR"/>
-        </w:rPr>
-      </w:pPr>
-      <w:r>
-        <w:rPr>
-          <w:lang w:val="tr-TR"/>
-        </w:rPr>
-        <w:t>Evrişimsel sinir ağı resimler için geliştirilen bir yapay sinir ağıdır. Bu sinir ağı resimlerin pikselleri arasındaki bağları kullanır. Yani kısaca verilecek olan veride yatayda ve dikeyde bir bağlantı olmalıdır. Bu sebeple hiyerarşik kümeleme yöntemi kullanılarak seçilen öznitelikler kendi aralarında sıralandılar.</w:t>
-      </w:r>
-      <w:r>
-        <w:rPr>
-          <w:lang w:val="tr-TR"/>
-        </w:rPr>
-        <w:t xml:space="preserve"> Böylelikle dikey bağlantı sağlanmış oldu. Zaman serisi kullanıldığı için yatay uyum için herhangi bir işlem yapılması gerekmedi.</w:t>
-      </w:r>
+        <w:rPr>
+          <w:lang w:val="tr-TR"/>
+        </w:rPr>
+      </w:pPr>
     </w:p>
     <w:p>
       <w:pPr>
-        <w:pStyle w:val="Heading2"/>
-        <w:rPr>
-          <w:lang w:val="tr-TR"/>
-        </w:rPr>
-      </w:pPr>
-      <w:r>
-        <w:rPr>
-          <w:lang w:val="tr-TR"/>
-        </w:rPr>
-        <w:t>Resim oluşturma</w:t>
-      </w:r>
-    </w:p>
-    <w:p>
-      <w:pPr>
-        <w:ind w:left="360"/>
-        <w:jc w:val="both"/>
-        <w:rPr>
-          <w:lang w:val="tr-TR"/>
-        </w:rPr>
-      </w:pPr>
-      <w:r>
-        <w:rPr>
-          <w:lang w:val="tr-TR"/>
-        </w:rPr>
-        <w:t>Model 28 özniteliği girdi olarak alacağı için ve evrişimsel sinir ağının eni-boyu aynı olan resimler istemesinden dolayı 28x28lik resimler oluşturmak gerekliydi. Bu resimleri elde edebilmek için kayan pencere yöntemi uygulanıp pencere her seferinde 1 gün sağa kaydırılarak 70.000 adet resim elde edildi.</w:t>
-      </w:r>
-    </w:p>
-    <w:p>
-      <w:pPr>
-        <w:pStyle w:val="Heading2"/>
-        <w:rPr>
-          <w:lang w:val="tr-TR"/>
-        </w:rPr>
-      </w:pPr>
-      <w:r>
-        <w:rPr>
-          <w:lang w:val="tr-TR"/>
-        </w:rPr>
-        <w:t>Evrişimsel sinir ağı</w:t>
-      </w:r>
-    </w:p>
-    <w:p>
-      <w:pPr>
-        <w:ind w:left="360"/>
-        <w:jc w:val="both"/>
-        <w:rPr>
-          <w:lang w:val="tr-TR"/>
-        </w:rPr>
-      </w:pPr>
-      <w:r>
-        <w:rPr>
-          <w:lang w:val="tr-TR"/>
-        </w:rPr>
-        <w:t>Model çeşitli katmanlardan oluşmaktadır.</w:t>
-      </w:r>
-      <w:r>
-        <w:rPr>
-          <w:lang w:val="tr-TR"/>
-        </w:rPr>
-        <w:t xml:space="preserve"> Ağ yapısı s</w:t>
-      </w:r>
-      <w:r>
-        <w:rPr>
-          <w:lang w:val="tr-TR"/>
-        </w:rPr>
-        <w:t>ırasıyla 2 adet aktivasyon fonksiyonu ‘</w:t>
-      </w:r>
-      <w:proofErr w:type="spellStart"/>
-      <w:r>
-        <w:rPr>
-          <w:lang w:val="tr-TR"/>
-        </w:rPr>
-        <w:t>relu</w:t>
-      </w:r>
-      <w:proofErr w:type="spellEnd"/>
-      <w:r>
-        <w:rPr>
-          <w:lang w:val="tr-TR"/>
-        </w:rPr>
-        <w:t>’ olan evrişimsel katman, 1 adet maksimum değeri alan katman</w:t>
-      </w:r>
-      <w:r>
-        <w:rPr>
-          <w:lang w:val="tr-TR"/>
-        </w:rPr>
-        <w:t>(</w:t>
-      </w:r>
-      <w:proofErr w:type="spellStart"/>
-      <w:r>
-        <w:rPr>
-          <w:lang w:val="tr-TR"/>
-        </w:rPr>
-        <w:t>maxpooling</w:t>
-      </w:r>
-      <w:proofErr w:type="spellEnd"/>
-      <w:r>
-        <w:rPr>
-          <w:lang w:val="tr-TR"/>
-        </w:rPr>
-        <w:t>)</w:t>
-      </w:r>
-      <w:r>
-        <w:rPr>
-          <w:lang w:val="tr-TR"/>
-        </w:rPr>
-        <w:t xml:space="preserve">, 1 adet </w:t>
-      </w:r>
-      <w:r>
-        <w:rPr>
-          <w:lang w:val="tr-TR"/>
-        </w:rPr>
-        <w:t xml:space="preserve">sinir ağının 4te birinin </w:t>
-      </w:r>
-      <w:proofErr w:type="spellStart"/>
-      <w:r>
-        <w:rPr>
-          <w:lang w:val="tr-TR"/>
-        </w:rPr>
-        <w:t>yoksayan</w:t>
-      </w:r>
-      <w:proofErr w:type="spellEnd"/>
-      <w:r>
-        <w:rPr>
-          <w:lang w:val="tr-TR"/>
-        </w:rPr>
-        <w:t xml:space="preserve"> katman(</w:t>
-      </w:r>
-      <w:proofErr w:type="spellStart"/>
-      <w:r>
-        <w:rPr>
-          <w:lang w:val="tr-TR"/>
-        </w:rPr>
-        <w:t>dropout</w:t>
-      </w:r>
-      <w:proofErr w:type="spellEnd"/>
-      <w:r>
-        <w:rPr>
-          <w:lang w:val="tr-TR"/>
-        </w:rPr>
-        <w:t>), 1 adet tümüyle bağlı katman(</w:t>
-      </w:r>
-      <w:proofErr w:type="spellStart"/>
-      <w:r>
-        <w:rPr>
-          <w:lang w:val="tr-TR"/>
-        </w:rPr>
-        <w:t>fully-connected</w:t>
-      </w:r>
-      <w:proofErr w:type="spellEnd"/>
-      <w:r>
-        <w:rPr>
-          <w:lang w:val="tr-TR"/>
-        </w:rPr>
-        <w:t>) ve 1 adet tümüyle bağlı ‘</w:t>
-      </w:r>
-      <w:proofErr w:type="spellStart"/>
-      <w:r>
-        <w:rPr>
-          <w:lang w:val="tr-TR"/>
-        </w:rPr>
-        <w:t>softmax</w:t>
-      </w:r>
-      <w:proofErr w:type="spellEnd"/>
-      <w:r>
-        <w:rPr>
-          <w:lang w:val="tr-TR"/>
-        </w:rPr>
-        <w:t>’ katmanından oluşmaktadır.</w:t>
-      </w:r>
-      <w:r>
-        <w:rPr>
-          <w:lang w:val="tr-TR"/>
-        </w:rPr>
-        <w:t xml:space="preserve"> </w:t>
-      </w:r>
-    </w:p>
-    <w:p>
-      <w:pPr>
-        <w:pStyle w:val="ListParagraph"/>
-        <w:jc w:val="both"/>
-        <w:rPr>
-          <w:lang w:val="tr-TR"/>
-        </w:rPr>
-      </w:pPr>
-    </w:p>
-    <w:p>
-      <w:pPr>
-        <w:pStyle w:val="Heading2"/>
-        <w:rPr>
-          <w:lang w:val="tr-TR"/>
-        </w:rPr>
-      </w:pPr>
-      <w:r>
-        <w:rPr>
-          <w:lang w:val="tr-TR"/>
-        </w:rPr>
-        <w:t>Sonuçlar</w:t>
-      </w:r>
-    </w:p>
-    <w:p>
-      <w:pPr>
-        <w:ind w:left="360"/>
-        <w:jc w:val="both"/>
-        <w:rPr>
-          <w:lang w:val="tr-TR"/>
-        </w:rPr>
-      </w:pPr>
-      <w:r>
-        <w:rPr>
-          <w:lang w:val="tr-TR"/>
-        </w:rPr>
-        <w:t xml:space="preserve">Değerlendirme için 10-fold çapraz değerlendirme yöntemi kullanılmıştır. </w:t>
-      </w:r>
-      <w:proofErr w:type="spellStart"/>
-      <w:r>
-        <w:rPr>
-          <w:lang w:val="tr-TR"/>
-        </w:rPr>
-        <w:t>Epoch</w:t>
-      </w:r>
-      <w:proofErr w:type="spellEnd"/>
-      <w:r>
-        <w:rPr>
-          <w:lang w:val="tr-TR"/>
-        </w:rPr>
-        <w:t xml:space="preserve"> sayısı 100 olarak belirlenmiş olup her seferinde resimlerin 1024 tanesiyle işlem yapılmaktadır. 70000 resim kontrol edildiğinden ve ağırlıklar onlara göre ayarlandığında bir </w:t>
-      </w:r>
-      <w:proofErr w:type="spellStart"/>
-      <w:r>
-        <w:rPr>
-          <w:lang w:val="tr-TR"/>
-        </w:rPr>
-        <w:t>epoch</w:t>
-      </w:r>
-      <w:proofErr w:type="spellEnd"/>
-      <w:r>
-        <w:rPr>
-          <w:lang w:val="tr-TR"/>
-        </w:rPr>
-        <w:t xml:space="preserve"> ilerlenmiş olmaktadır. Çözücü olarak ‘</w:t>
-      </w:r>
-      <w:proofErr w:type="spellStart"/>
-      <w:r>
-        <w:rPr>
-          <w:lang w:val="tr-TR"/>
-        </w:rPr>
-        <w:t>adadelta</w:t>
-      </w:r>
-      <w:proofErr w:type="spellEnd"/>
-      <w:r>
-        <w:rPr>
-          <w:lang w:val="tr-TR"/>
-        </w:rPr>
-        <w:t xml:space="preserve">’ algoritması kullanılmıştır. Doğruluk göz önüne alınarak ağırlıklar güncellenmiştir. Alıcı işletim </w:t>
-      </w:r>
-      <w:r>
-        <w:rPr>
-          <w:lang w:val="tr-TR"/>
-        </w:rPr>
-        <w:lastRenderedPageBreak/>
-        <w:t>karakteristiği (ROC) ve kesinlik-hassasiyet (</w:t>
-      </w:r>
-      <w:proofErr w:type="spellStart"/>
-      <w:r>
-        <w:rPr>
-          <w:lang w:val="tr-TR"/>
-        </w:rPr>
-        <w:t>precision-recall</w:t>
-      </w:r>
-      <w:proofErr w:type="spellEnd"/>
-      <w:r>
-        <w:rPr>
-          <w:lang w:val="tr-TR"/>
-        </w:rPr>
-        <w:t xml:space="preserve">) eğrileri figür 1 ve 2 de gösterilmiştir. 10-fold </w:t>
-      </w:r>
-      <w:r>
-        <w:rPr>
-          <w:lang w:val="tr-TR"/>
-        </w:rPr>
-        <w:t>doğruluk tablosu tablo 1 de gösterilmiştir.</w:t>
-      </w:r>
-    </w:p>
-    <w:p>
-      <w:pPr>
-        <w:ind w:left="360"/>
-        <w:rPr>
-          <w:lang w:val="tr-TR"/>
-        </w:rPr>
-      </w:pPr>
-    </w:p>
-    <w:p>
-      <w:pPr>
-        <w:ind w:left="360"/>
-        <w:rPr>
-          <w:lang w:val="tr-TR"/>
-        </w:rPr>
-      </w:pPr>
-    </w:p>
-    <w:p>
-      <w:pPr>
         <w:ind w:left="360"/>
         <w:jc w:val="center"/>
         <w:rPr>
@@ -690,7 +716,19 @@
         <w:rPr>
           <w:lang w:val="tr-TR"/>
         </w:rPr>
-        <w:t>Tablo 1. Doğruluk sonuçları</w:t>
+        <w:t xml:space="preserve">Tablo 1. </w:t>
+      </w:r>
+      <w:r>
+        <w:rPr>
+          <w:lang w:val="tr-TR"/>
+        </w:rPr>
+        <w:t>Başarım</w:t>
+      </w:r>
+      <w:r>
+        <w:rPr>
+          <w:lang w:val="tr-TR"/>
+        </w:rPr>
+        <w:t xml:space="preserve"> sonuçları</w:t>
       </w:r>
     </w:p>
     <w:tbl>
@@ -758,7 +796,7 @@
                 <w:b/>
                 <w:lang w:val="tr-TR"/>
               </w:rPr>
-              <w:t>Doğruluk</w:t>
+              <w:t>Başarım</w:t>
             </w:r>
           </w:p>
         </w:tc>

</xml_diff>